<commit_message>
Record the measured CPU re-run in the docs; fix the shard-collection step
The corrected scorer was run on all five experiments in float32 on free CPU
runners. Its measured numbers (noise vs hallucination -0.12, noise vs composite
+0.62, accuracy 0.20, no weighting passing both tests) replace the estimated
brackets in the README, chapter, results README, demo page, Gradio app and both
Word reports. CI now also reproduces the sweep on results/cpu_fp32.

Fixes the replay job's cache collection, which derived the shard number from a
ref name that has no dash (so no cache was found).

Co-Authored-By: Claude Sonnet 5.5 <noreply@anthropic.com>
Claude-Session: https://claude.ai/code/session_01EJuYUTnyMnJBfVyrhL8Ahu
</commit_message>
<xml_diff>
--- a/NRF_Supporting_Evidence_v3.docx
+++ b/NRF_Supporting_Evidence_v3.docx
@@ -12589,7 +12589,7 @@
                 <w:sz w:val="19"/>
                 <w:szCs w:val="19"/>
               </w:rPr>
-              <w:t xml:space="preserve">+0.00 to +0.89</w:t>
+              <w:t xml:space="preserve">+0.00 to +0.89; re-run −0.12</w:t>
             </w:r>
           </w:p>
         </w:tc>
@@ -12666,7 +12666,7 @@
                 <w:sz w:val="19"/>
                 <w:szCs w:val="19"/>
               </w:rPr>
-              <w:t xml:space="preserve">+0.18 to −0.36</w:t>
+              <w:t xml:space="preserve">+0.18 to −0.36; re-run +0.62</w:t>
             </w:r>
           </w:p>
         </w:tc>
@@ -12765,7 +12765,7 @@
           <w:sz w:val="22"/>
           <w:szCs w:val="22"/>
         </w:rPr>
-        <w:t xml:space="preserve">Two conclusions survive. The ranking inversion remains at the default weights, now as a near tie (gap 0.0013, down from 0.0080), and no weighting passes both tests in any of the corrected scenarios. Two do not. The doubling of the hallucination rate under evidence injection in Experiment 2 was this defect, and the Experiment 4 noise correlations cannot be fixed without regenerating that run. Accuracy, calibration, the verifier outcomes and Experiment 3 do not use evidence support and are unaffected. Experiments 1, 2, 4 and 5 should be re-run on the GPU with the corrected scorer.</w:t>
+        <w:t xml:space="preserve">Two conclusions survive. The ranking inversion remains at the default weights, now as a near tie (gap 0.0013, down from 0.0080), and no weighting passes both tests in any of the corrected scenarios. Two do not. The doubling of the hallucination rate under evidence injection in Experiment 2 was this defect, and the Experiment 4 noise correlations cannot be fixed without regenerating that run. Accuracy, calibration, the verifier outcomes and Experiment 3 do not use evidence support and are unaffected. A full-precision CPU re-run of all five experiments with the corrected scorer then measured these quantities directly. In Experiment 4, noise against hallucination rate was −0.12 rather than +0.76, with at most three flagged responses per level, and noise against the composite was +0.62 rather than −0.10. In Experiment 5, retrieval and oracle evidence both reached 0.200 accuracy, so the ranking inversion could not be tested, and no weighting passed both tests. Accuracy fell from 0.34 to 0.20 from numeric precision alone. A 4-bit GPU re-run would make the comparison like for like.</w:t>
       </w:r>
     </w:p>
     <w:p>
@@ -15048,7 +15048,7 @@
           <w:sz w:val="22"/>
           <w:szCs w:val="22"/>
         </w:rPr>
-        <w:t xml:space="preserve"> Experiments 1, 2, 4 and 5 should also be re-run with the corrected evidence-support scorer (Section 4.7).</w:t>
+        <w:t xml:space="preserve"> A 4-bit GPU re-run with the corrected evidence-support scorer would complete the comparison in Section 4.7.</w:t>
       </w:r>
     </w:p>
     <w:p>

</xml_diff>

<commit_message>
Fold the second model family and the sampled seeds into the docs; align the Gradio text and results README
Co-Authored-By: Claude Sonnet 5.5 <noreply@anthropic.com>
Claude-Session: https://claude.ai/code/session_01EJuYUTnyMnJBfVyrhL8Ahu
</commit_message>
<xml_diff>
--- a/NRF_Supporting_Evidence_v3.docx
+++ b/NRF_Supporting_Evidence_v3.docx
@@ -12811,6 +12811,20 @@
           <w:szCs w:val="22"/>
         </w:rPr>
         <w:t xml:space="preserve">The Experiment 4 noise sentences do not degrade the model. Paired within item, from 0% to 40% noise, Qwen2.5-3B accuracy changes by +0.007 (95% CI −0.05 to +0.07) on development and −0.027 (−0.07 to +0.03) on test; evidence support, the hallucination flag, entailment support and support against the clean evidence are likewise indistinguishable from zero. Experiment 4 as designed therefore could not test whether the composite tracks degradation. The five-level correlation of noise with the composite is also unstable: +0.09 on development and −0.64 on test for the same model, each with an interval of about ±0.8.</w:t>
+      </w:r>
+    </w:p>
+    <w:p>
+      <w:pPr>
+        <w:spacing w:after="120" w:line="276"/>
+        <w:jc w:val="both"/>
+      </w:pPr>
+      <w:r>
+        <w:rPr>
+          <w:rFonts w:ascii="Calibri" w:cs="Calibri" w:eastAsia="Calibri" w:hAnsi="Calibri"/>
+          <w:sz w:val="22"/>
+          <w:szCs w:val="22"/>
+        </w:rPr>
+        <w:t xml:space="preserve">Other models and seeds agree that single numbers do not hold still. On SmolLM2-1.7B (development) oracle evidence does beat retrieval (accuracy 0.28 against 0.16), the noise correlation with the composite is −0.81 (95% CI −0.97 to +0.52), and 73.1% of weightings pass both original tests, against 0.0% for Qwen2.5-3B on development. Qwen2.5-1.5B sampled at temperature 0.7 with three seeds gives noise correlations of +0.46, +0.52 and −0.37 (the greedy run gave −0.27) and per-item accuracy changes under noise of +0.02, +0.05 and −0.11; of eight noise-injection runs only one interval (−0.22 to −0.01) excludes zero, so the manipulation’s effect is at most small and inconsistent.</w:t>
       </w:r>
     </w:p>
     <w:p>

</xml_diff>